<commit_message>
Document payroll reconciliation and remove employee data from public docs
Documents the three reconciliation behaviours added to the HR time punches sync
(filling late clock-outs, failing on an empty fetch, reporting drift from MTEK)
and regenerates the workflow's .docx, which predated Overall Status, the
append-only Notes log and active-view employee matching.

This repository is public, and earlier doc commits named individual employees
and included one employee's hourly pay rate and a studio's weekly wage total.
Those are removed here and the documentation skill now forbids personal or pay
data in committed files. This is forward-only: the earlier content remains in
git history.

Co-Authored-By: Claude Opus 5 <noreply@anthropic.com>
</commit_message>
<xml_diff>
--- a/docs/HR_Payroll_Time_Punches_Documentation.docx
+++ b/docs/HR_Payroll_Time_Punches_Documentation.docx
@@ -20,7 +20,12 @@
     </w:p>
     <w:p>
       <w:r>
-        <w:t xml:space="preserve">IMPORTANT: This runs against the HR base (appiwfeujJzUZPPBx), NOT HR - Instructors (appBC0Ja4B5LKbZLW). This is STAFF payroll (hourly employees, time clock punches). The instructor payroll system ("Payroll Class log" -&gt; "Classes (for Payroll)") is a separate system in a different base. Both bases contain Employees, Studios and Rates tables with different IDs and different fields, so always confirm which base you are in before changing anything payroll-related.</w:t>
+        <w:t xml:space="preserve">IMPORTANT: This runs against the HR base (appiwfeujJzUZPPBx), NOT HR - Instructors (appBC0Ja4B5LKbZLW). This is STAFF payroll (hourly employees, time clock punches). The instructor payroll system ("Payroll Class log" -&gt; "Classes (for Payroll)") is separate. Both bases contain Employees, Studios and Rates tables with different IDs, so always confirm which base you are in.</w:t>
+      </w:r>
+    </w:p>
+    <w:p>
+      <w:r>
+        <w:t xml:space="preserve">PRIVACY: this repository is public. This document deliberately contains no employee names and no individual or aggregate pay figures. Keep it that way when editing.</w:t>
       </w:r>
     </w:p>
     <w:p>
@@ -33,7 +38,7 @@
     </w:p>
     <w:p>
       <w:r>
-        <w:t xml:space="preserve">Pulls Mariana Tek time clock punches for one week at one studio into the Airtable "Time Punches" table, then links each punch to its Employee and its Rate so that hours and wages can be calculated for payroll. One run covers exactly one "Budget week - Studio" record, which supplies both the date window (via its linked Budget week) and the studio (via its Studio link).</w:t>
+        <w:t xml:space="preserve">Pulls Mariana Tek time clock punches for one week at one studio into the Airtable "Time Punches" table, links each punch to its Employee and Rate, and reconciles against what was imported before, so hours and wages can be calculated for payroll. One run covers one "Budget week - Studio" record, which supplies the date window (via its Budget week) and the studio.</w:t>
       </w:r>
     </w:p>
     <w:p>
@@ -46,32 +51,32 @@
     </w:p>
     <w:p>
       <w:r>
-        <w:t xml:space="preserve">- Triggered on demand per Budget week - Studio record, or manually via workflow_dispatch with a record_id input.</w:t>
-      </w:r>
-    </w:p>
-    <w:p>
-      <w:r>
-        <w:t xml:space="preserve">- Reads Start Date, End Date and Studio from the triggering record, and resolves the studio to its MTEK Location ID.</w:t>
-      </w:r>
-    </w:p>
-    <w:p>
-      <w:r>
-        <w:t xml:space="preserve">- Fetches MTEK time_clock_shifts for that location and window, with employee and shift type sideloaded.</w:t>
-      </w:r>
-    </w:p>
-    <w:p>
-      <w:r>
-        <w:t xml:space="preserve">- Skips any punch already imported (see section 9), creates the rest in Time Punches.</w:t>
-      </w:r>
-    </w:p>
-    <w:p>
-      <w:r>
-        <w:t xml:space="preserve">- Matches each new punch to an Employee by exact name, then to a Rate by "&lt;Employee name&gt; &lt;Rate Type&gt;".</w:t>
-      </w:r>
-    </w:p>
-    <w:p>
-      <w:r>
-        <w:t xml:space="preserve">- Writes a summary line into Notes on the triggering record and sets four status fields as it goes.</w:t>
+        <w:t xml:space="preserve">- Triggered on demand per Budget week - Studio record via its Fetch time punches button, or manually via workflow_dispatch with a record_id.</w:t>
+      </w:r>
+    </w:p>
+    <w:p>
+      <w:r>
+        <w:t xml:space="preserve">- Sets Overall Status to Started, then fetches MTEK time_clock_shifts for the studio's location and week.</w:t>
+      </w:r>
+    </w:p>
+    <w:p>
+      <w:r>
+        <w:t xml:space="preserve">- Fails loudly if MTEK returns no punches at all (section 11).</w:t>
+      </w:r>
+    </w:p>
+    <w:p>
+      <w:r>
+        <w:t xml:space="preserve">- Reconciles against punches already on the row: creates new ones, fills clock-outs that were open last time, and reports anything that disagrees with MTEK without overwriting it (section 9).</w:t>
+      </w:r>
+    </w:p>
+    <w:p>
+      <w:r>
+        <w:t xml:space="preserve">- Matches new punches to an Employee (from the Active Employees - ALL view) and to a Rate.</w:t>
+      </w:r>
+    </w:p>
+    <w:p>
+      <w:r>
+        <w:t xml:space="preserve">- Appends a timestamped summary to Notes and sets the status fields.</w:t>
       </w:r>
     </w:p>
     <w:p>
@@ -84,32 +89,27 @@
     </w:p>
     <w:p>
       <w:r>
-        <w:t xml:space="preserve">The "Fetch time punches" field on Budget week - Studio is a formula producing a clickable Make webhook URL with RECORD_ID() on the query string. Clicking it in Airtable is a plain browser GET, and GitHub's dispatch API requires an authenticated POST, so a Make scenario bridges the two.</w:t>
-      </w:r>
-    </w:p>
-    <w:p>
-      <w:r>
-        <w:t xml:space="preserve">- Make scenario: "HR Fetch time punches" (scenario 6166754, webhook 2777677) in the b.cycle Make team (608569).</w:t>
-      </w:r>
-    </w:p>
-    <w:p>
-      <w:r>
-        <w:t xml:space="preserve">- It reads recordId from the query string and sends repository_dispatch of type airtable-hr-payroll-time-punches with client_payload.record_id.</w:t>
-      </w:r>
-    </w:p>
-    <w:p>
-      <w:r>
-        <w:t xml:space="preserve">- Authentication uses the GITHUB BEARER keychain key (Make key 86508) through the http:MakeRequest module, so no token is stored in the scenario blueprint. This mirrors the existing "e3un - Get new profiles yesterday" scenario; copy that one if this ever needs rebuilding.</w:t>
-      </w:r>
-    </w:p>
-    <w:p>
-      <w:r>
-        <w:t xml:space="preserve">- NOTE: Make "Keys" are a separate store from Make "Connections". The GitHub entries under Connections point at gitmcp.io and GitHub Copilot and cannot authorize a dispatch. The usable credential is under Keys.</w:t>
-      </w:r>
-    </w:p>
-    <w:p>
-      <w:r>
-        <w:t xml:space="preserve">- The webhook URL itself is deliberately not recorded in this repository, which is public. Retrieve it from the Make scenario or from the Airtable formula field.</w:t>
+        <w:t xml:space="preserve">"Fetch time punches" on Budget week - Studio is an Open URL button whose URL is a Make webhook carrying RECORD_ID(). A browser click is a GET and GitHub's dispatch API needs an authenticated POST, so a Make scenario bridges the two.</w:t>
+      </w:r>
+    </w:p>
+    <w:p>
+      <w:r>
+        <w:t xml:space="preserve">- Make scenario "HR Fetch time punches" (scenario 6166754, webhook 2777677) in the b.cycle Make team (608569) reads recordId and sends repository_dispatch type airtable-hr-payroll-time-punches.</w:t>
+      </w:r>
+    </w:p>
+    <w:p>
+      <w:r>
+        <w:t xml:space="preserve">- It authenticates with the GITHUB BEARER keychain key (Make key 86508) through http:MakeRequest, so no token sits in the blueprint. Copy the "e3un - Get new profiles yesterday" scenario if it ever needs rebuilding. Make Keys are separate from Make Connections; the GitHub entries under Connections cannot authorize a dispatch.</w:t>
+      </w:r>
+    </w:p>
+    <w:p>
+      <w:r>
+        <w:t xml:space="preserve">- The GITHUB BEARER key is shared by several scenarios. Rotating it breaks all of them.</w:t>
+      </w:r>
+    </w:p>
+    <w:p>
+      <w:r>
+        <w:t xml:space="preserve">- The webhook URL is deliberately not recorded here because the repository is public. Get it from the Make scenario or the Airtable button.</w:t>
       </w:r>
     </w:p>
     <w:p>
@@ -122,42 +122,47 @@
     </w:p>
     <w:p>
       <w:r>
-        <w:t xml:space="preserve">MTEK: GET /api/time_clock_shifts, JSON:API format, same pagination shape as class_sessions (meta.pagination.pages). Query parameters used: location, min_start_datetime, max_start_datetime, include=employee.user,shift_type, page, page_size=100.</w:t>
-      </w:r>
-    </w:p>
-    <w:p>
-      <w:r>
-        <w:t xml:space="preserve">MTEK quirks, all found the hard way:</w:t>
-      </w:r>
-    </w:p>
-    <w:p>
-      <w:r>
-        <w:t xml:space="preserve">- min_date, max_date, start_date and end_date are SILENTLY IGNORED on this endpoint. Passing them returns the entire unfiltered punch history rather than an error. Only min_start_datetime and max_start_datetime actually filter.</w:t>
-      </w:r>
-    </w:p>
-    <w:p>
-      <w:r>
-        <w:t xml:space="preserve">- Even those bounds are applied loosely at the edges, so the script pads the query window by one day either side and enforces the real America/Toronto date range itself in code.</w:t>
-      </w:r>
-    </w:p>
-    <w:p>
-      <w:r>
-        <w:t xml:space="preserve">- A punch carries employee and shift type as bare relationship IDs only. Names require include=employee.user,shift_type, and the employee name lives on the nested user object (full_name), not on the employees object.</w:t>
-      </w:r>
-    </w:p>
-    <w:p>
-      <w:r>
-        <w:t xml:space="preserve">- shift_types.name (MC/SC, EE, Team Lead, Reception &amp; Clean, Admin Hours, ...) matches the Shift Type options on the Rates table exactly. That is what makes the rate match work.</w:t>
-      </w:r>
-    </w:p>
-    <w:p>
-      <w:r>
-        <w:t xml:space="preserve">- MTEK appears to round a shift duration to the quarter hour once the shift closes; only in-progress shifts carry sub-minute seconds.</w:t>
-      </w:r>
-    </w:p>
-    <w:p>
-      <w:r>
-        <w:t xml:space="preserve">Airtable: GET/PATCH the Budget week - Studio run record, GET the Studio record, GET Employees and Rates for matching, POST Time Punches in batches of 10, PATCH Time Punches in batches of 10.</w:t>
+        <w:t xml:space="preserve">MTEK: GET /api/time_clock_shifts (JSON:API, meta.pagination.pages). Parameters: location, min_start_datetime, max_start_datetime, include=employee.user,shift_type, page, page_size=100.</w:t>
+      </w:r>
+    </w:p>
+    <w:p>
+      <w:r>
+        <w:t xml:space="preserve">MTEK behaviour found the hard way:</w:t>
+      </w:r>
+    </w:p>
+    <w:p>
+      <w:r>
+        <w:t xml:space="preserve">- min_date, max_date, start_date and end_date are SILENTLY IGNORED on this endpoint and return the entire history. Only min_start_datetime / max_start_datetime filter.</w:t>
+      </w:r>
+    </w:p>
+    <w:p>
+      <w:r>
+        <w:t xml:space="preserve">- Those bounds are loose at the edges (MTEK over-returns past the max bound), so the script pads the window a day either side and enforces the real America/Toronto range itself.</w:t>
+      </w:r>
+    </w:p>
+    <w:p>
+      <w:r>
+        <w:t xml:space="preserve">- An unknown location ID returns 0 punches. A BLANK location returns every studio's punches. The script refuses to query when a studio has no MTEK Location ID; that guard is load-bearing and must not be removed.</w:t>
+      </w:r>
+    </w:p>
+    <w:p>
+      <w:r>
+        <w:t xml:space="preserve">- Punches carry employee and shift type as relationship IDs only; names need include=employee.user,shift_type, and the name is on the nested user (full_name).</w:t>
+      </w:r>
+    </w:p>
+    <w:p>
+      <w:r>
+        <w:t xml:space="preserve">- shift_types.name matches the Shift Type options on the Rates table exactly, which is what makes rate matching work.</w:t>
+      </w:r>
+    </w:p>
+    <w:p>
+      <w:r>
+        <w:t xml:space="preserve">- Punches expose only start_datetime, end_datetime, duration and user_has_turf_access. There is no status or approval field, so nothing is excluded by state.</w:t>
+      </w:r>
+    </w:p>
+    <w:p>
+      <w:r>
+        <w:t xml:space="preserve">Airtable: GET/PATCH the run record, GET the Studio, GET Employees (via view) and Rates, GET existing punches by record ID, POST and PATCH Time Punches in batches of 10.</w:t>
       </w:r>
     </w:p>
     <w:p>
@@ -175,22 +180,17 @@
     </w:p>
     <w:p>
       <w:r>
-        <w:t xml:space="preserve">- AIRTABLE_RECORD_ID: resolved from the workflow_dispatch input or repository_dispatch client_payload.record_id</w:t>
-      </w:r>
-    </w:p>
-    <w:p>
-      <w:r>
-        <w:t xml:space="preserve">- AIRTABLE_BASE_ID (appiwfeujJzUZPPBx), AIRTABLE_RUNS_TABLE_ID (tblbyFY6TlRi4BxOe), AIRTABLE_PUNCHES_TABLE_ID (tblVxt2W7NanQmJFR), AIRTABLE_EMPLOYEES_TABLE_ID (tbl0FzJ2s4Mk5jWIi), AIRTABLE_RATES_TABLE_ID (tblufK9k5Tg5uCd74), AIRTABLE_STUDIOS_TABLE_ID (tblAXy4xm0kJMkWeQ)</w:t>
-      </w:r>
-    </w:p>
-    <w:p>
-      <w:r>
-        <w:t xml:space="preserve">- MTEK_BASE_URL (https://bcycle.marianatek.com), MTEK_PUNCHES_PATH (/api/time_clock_shifts), PAYROLL_TIME_ZONE (America/Toronto)</w:t>
-      </w:r>
-    </w:p>
-    <w:p>
-      <w:r>
-        <w:t xml:space="preserve">- All base and table IDs are set directly in the workflow file; no extra secrets are required to change them.</w:t>
+        <w:t xml:space="preserve">- AIRTABLE_RECORD_ID: from workflow_dispatch input or repository_dispatch client_payload.record_id</w:t>
+      </w:r>
+    </w:p>
+    <w:p>
+      <w:r>
+        <w:t xml:space="preserve">- AIRTABLE_BASE_ID (appiwfeujJzUZPPBx), AIRTABLE_RUNS_TABLE_ID (tblbyFY6TlRi4BxOe), AIRTABLE_PUNCHES_TABLE_ID (tblVxt2W7NanQmJFR), AIRTABLE_EMPLOYEES_TABLE_ID (tbl0FzJ2s4Mk5jWIi), AIRTABLE_EMPLOYEES_VIEW_ID (viws8tSbvXfujLnwG), AIRTABLE_RATES_TABLE_ID (tblufK9k5Tg5uCd74), AIRTABLE_STUDIOS_TABLE_ID (tblAXy4xm0kJMkWeQ)</w:t>
+      </w:r>
+    </w:p>
+    <w:p>
+      <w:r>
+        <w:t xml:space="preserve">- MTEK_BASE_URL (https://bcycle.marianatek.com), MTEK_PUNCHES_PATH, PAYROLL_TIME_ZONE (America/Toronto)</w:t>
       </w:r>
     </w:p>
     <w:p>
@@ -208,32 +208,32 @@
     </w:p>
     <w:p>
       <w:r>
-        <w:t xml:space="preserve">Phase 1 - setup: clears the downstream status fields and Notes, sets Time punch Status and Time in/out Status to Started, reads Start Date / End Date / Studio off the run record, and resolves the Studio to its MTEK Location ID. Fails clearly if the record has no Budget week link, no Studio, or the Studio has no MTEK Location ID.</w:t>
-      </w:r>
-    </w:p>
-    <w:p>
-      <w:r>
-        <w:t xml:space="preserve">Phase 2 - fetch: pulls all pages of time_clock_shifts for the padded window, collecting the sideloaded included[] records into a lookup keyed by type and id. Each shift is filtered to the true local date range, skipped if already imported, and turned into a Time Punches record.</w:t>
-      </w:r>
-    </w:p>
-    <w:p>
-      <w:r>
-        <w:t xml:space="preserve">Phase 3 - employees: loads all Employees (Name), matches case-insensitively on the punch's Employee Name, patches the Employee link. Counts anything unmatched.</w:t>
-      </w:r>
-    </w:p>
-    <w:p>
-      <w:r>
-        <w:t xml:space="preserve">Phase 4 - rates: loads all Rates (Name, Rate), matches case-insensitively on "&lt;Employee Name&gt; &lt;Rate Type&gt;", patches the Rate link, and accumulates total hours and wages for the summary.</w:t>
-      </w:r>
-    </w:p>
-    <w:p>
-      <w:r>
-        <w:t xml:space="preserve">Phase 5 - summary: writes the Notes line and the final statuses.</w:t>
-      </w:r>
-    </w:p>
-    <w:p>
-      <w:r>
-        <w:t xml:space="preserve">Total Hours is deliberately NOT written by the script. It is an Airtable formula over the Time In / Time Out text so that a hand-corrected punch recalculates. The script recomputes the same HH:MM arithmetic in memory purely so the totals in Notes agree with the column.</w:t>
+        <w:t xml:space="preserve">Phase 1 - setup: sets Overall, Time punch and Time in/out Status to Started, clears Employee and Rate type Status, resolves the Studio to its MTEK Location ID.</w:t>
+      </w:r>
+    </w:p>
+    <w:p>
+      <w:r>
+        <w:t xml:space="preserve">Phase 2 - fetch and reconcile: pulls every page, filters to the local week, fails if empty, then compares with punches already on the row (section 9). Creates new punches and writes any filled clock-outs.</w:t>
+      </w:r>
+    </w:p>
+    <w:p>
+      <w:r>
+        <w:t xml:space="preserve">Phase 3 - employees: matches new punches against the Active Employees - ALL view.</w:t>
+      </w:r>
+    </w:p>
+    <w:p>
+      <w:r>
+        <w:t xml:space="preserve">Phase 4 - rates: matches new punches on "&lt;Employee Name&gt; &lt;Rate Type&gt;".</w:t>
+      </w:r>
+    </w:p>
+    <w:p>
+      <w:r>
+        <w:t xml:space="preserve">Phase 5 - summary: totals across every punch on the row, appends Notes, sets final statuses.</w:t>
+      </w:r>
+    </w:p>
+    <w:p>
+      <w:r>
+        <w:t xml:space="preserve">Total Hours is an Airtable formula over Time In / Time Out and is never written by the script, so a hand-corrected punch recalculates.</w:t>
       </w:r>
     </w:p>
     <w:p>
@@ -246,22 +246,12 @@
     </w:p>
     <w:p>
       <w:r>
-        <w:t xml:space="preserve">Workflow file: .github/workflows/hr-payroll-time-punches.yml</w:t>
-      </w:r>
-    </w:p>
-    <w:p>
-      <w:r>
-        <w:t xml:space="preserve">Triggers: workflow_dispatch with a required record_id input, and repository_dispatch of type airtable-hr-payroll-time-punches.</w:t>
-      </w:r>
-    </w:p>
-    <w:p>
-      <w:r>
-        <w:t xml:space="preserve">Steps: checkout, setup Node 20, resolve record id (fails if absent), run the script.</w:t>
-      </w:r>
-    </w:p>
-    <w:p>
-      <w:r>
-        <w:t xml:space="preserve">GOTCHA when editing this file: an unquoted YAML scalar containing ": " breaks the whole workflow. GitHub then reports the workflow name as the file path and refuses workflow_dispatch entirely, with a 0-second failed run on push and no job. The input description here is single-quoted for exactly that reason. Note bcycle-payroll-classes.yml still has this bug and has never been dispatchable.</w:t>
+        <w:t xml:space="preserve">Workflow file: .github/workflows/hr-payroll-time-punches.yml. Triggers: workflow_dispatch (record_id required) and repository_dispatch airtable-hr-payroll-time-punches. Steps: checkout, setup Node, resolve record id, run.</w:t>
+      </w:r>
+    </w:p>
+    <w:p>
+      <w:r>
+        <w:t xml:space="preserve">GOTCHA: an unquoted YAML scalar containing ": " breaks the workflow entirely and makes it undispatchable. The input description is single-quoted for that reason.</w:t>
       </w:r>
     </w:p>
     <w:p>
@@ -274,40 +264,60 @@
     </w:p>
     <w:p>
       <w:r>
-        <w:t xml:space="preserve">Budget week (tblt2pfs356rDVDIa): Start Date, End Date. One row per payroll week, created by the HR Create Budget week action.</w:t>
-      </w:r>
-    </w:p>
-    <w:p>
-      <w:r>
-        <w:t xml:space="preserve">Budget week - Studio (tblbyFY6TlRi4BxOe): the run record. Name (formula), Budget week link, Studio link, Start/End Date lookups, Fetch time punches (formula URL), four status fields, Notes, Time Punch for payroll link, Record ID.</w:t>
-      </w:r>
-    </w:p>
-    <w:p>
-      <w:r>
-        <w:t xml:space="preserve">Time Punches (tblVxt2W7NanQmJFR): Date, Time In, Time Out, MTEK ID, Location ID, Employee Name, Rate Type (all written from MTEK); Employee and Rate links (matched); First name, Last name, Desjardins ID, Hourly rate (lookups); Total Hours (formula over Time In/Out); Wages (Total Hours * Hourly rate).</w:t>
-      </w:r>
-    </w:p>
-    <w:p>
-      <w:pPr>
-        <w:pStyle w:val="Heading2"/>
-      </w:pPr>
-      <w:r>
-        <w:t xml:space="preserve">9. Dedupe Behavior</w:t>
-      </w:r>
-    </w:p>
-    <w:p>
-      <w:r>
-        <w:t xml:space="preserve">Each punch stores MTEK's own time_clock_shift id in the MTEK ID field. At the start of a run the script reads back the MTEK IDs already linked to the triggering record and skips any shift it has seen. Clicking Fetch twice therefore creates nothing and reports "# of Duplicates skipped".</w:t>
-      </w:r>
-    </w:p>
-    <w:p>
-      <w:r>
-        <w:t xml:space="preserve">Punches whose times later change in MTEK are deliberately NOT overwritten, because Total Hours is meant to stay hand-correctable. If that trade-off is ever revisited, flagging the drift in Notes is preferable to silently overwriting a manual correction.</w:t>
-      </w:r>
-    </w:p>
-    <w:p>
-      <w:r>
-        <w:t xml:space="preserve">Historic note: punches imported before the MTEK ID field existed were backfilled by matching date + time in + employee name against MTEK. Any future punch created without an MTEK ID will duplicate on the next run.</w:t>
+        <w:t xml:space="preserve">Budget week (tblt2pfs356rDVDIa): Start Date, End Date.</w:t>
+      </w:r>
+    </w:p>
+    <w:p>
+      <w:r>
+        <w:t xml:space="preserve">Budget week - Studio (tblbyFY6TlRi4BxOe): Name (formula), Budget week, Studio, Start/End Date lookups, Fetch time punches (button), Overall Status, Time punch / Time in/out / Employee / Rate type Status, Notes, Time Punch for payroll, Record ID, MIN/MAX Date Time Punches (rollups), Date Range Check (formula).</w:t>
+      </w:r>
+    </w:p>
+    <w:p>
+      <w:r>
+        <w:t xml:space="preserve">Time Punches (tblVxt2W7NanQmJFR): Date, Time In, Time Out, MTEK ID, Location ID, Employee Name, Rate Type (from MTEK); Employee, Rate (matched); First name, Last name, Desjardins ID, Hourly rate (lookups); Total Hours (formula); Wages (Total Hours * Hourly rate).</w:t>
+      </w:r>
+    </w:p>
+    <w:p>
+      <w:pPr>
+        <w:pStyle w:val="Heading2"/>
+      </w:pPr>
+      <w:r>
+        <w:t xml:space="preserve">9. Dedupe and Reconciliation</w:t>
+      </w:r>
+    </w:p>
+    <w:p>
+      <w:r>
+        <w:t xml:space="preserve">Each punch stores MTEK's time_clock_shift id in MTEK ID. On every run the script reads the punches already on the row and, for each punch MTEK returns:</w:t>
+      </w:r>
+    </w:p>
+    <w:p>
+      <w:r>
+        <w:t xml:space="preserve">- Not on the row yet: created.</w:t>
+      </w:r>
+    </w:p>
+    <w:p>
+      <w:r>
+        <w:t xml:space="preserve">- Already on the row with a blank Time Out, and MTEK now has one: the clock-out is filled in. It is written only into a blank field, so a hand correction is never overwritten. Without this, a punch imported while still open would stay at 0 hours forever, because dedupe would skip it.</w:t>
+      </w:r>
+    </w:p>
+    <w:p>
+      <w:r>
+        <w:t xml:space="preserve">- Already on the row but disagreeing on date, time in or time out: listed in Notes under "Differs from MTEK" and left alone. It may be an MTEK edit made after import or a deliberate correction in Airtable; the script cannot tell which.</w:t>
+      </w:r>
+    </w:p>
+    <w:p>
+      <w:r>
+        <w:t xml:space="preserve">Separately, any punch on the row whose MTEK ID MTEK no longer returns is listed under "No longer in MTEK" and left alone.</w:t>
+      </w:r>
+    </w:p>
+    <w:p>
+      <w:r>
+        <w:t xml:space="preserve">Re-running is therefore safe and is the recovery path: it picks up late-added punches and finishes a half-completed run, while never duplicating or overwriting.</w:t>
+      </w:r>
+    </w:p>
+    <w:p>
+      <w:r>
+        <w:t xml:space="preserve">Dedupe is scoped to one Budget week - Studio row. Two rows for the same studio and week would import the same punches twice.</w:t>
       </w:r>
     </w:p>
     <w:p>
@@ -320,124 +330,213 @@
     </w:p>
     <w:p>
       <w:r>
-        <w:t xml:space="preserve">- Time punch Status and Time in/out Status: both set to Started at the top of the run, both set to COMPLETE once the punches are created.</w:t>
-      </w:r>
-    </w:p>
-    <w:p>
-      <w:r>
-        <w:t xml:space="preserve">- Employee Status: Started once the punches are in; COMPLETE - Employees assigned at the end, or PROBLEM if any employee went unmatched.</w:t>
-      </w:r>
-    </w:p>
-    <w:p>
-      <w:r>
-        <w:t xml:space="preserve">- Rate type Status: Started once the employees are done; COMPLETE - Rates assigned, or PROBLEM if any rate went unmatched. An unmatched rate silently pays someone nothing, so it is treated as a failure rather than a note.</w:t>
-      </w:r>
-    </w:p>
-    <w:p>
-      <w:r>
-        <w:t xml:space="preserve">- Employee and Rate type statuses are cleared at the start of a run so a re-run cannot display the previous run's COMPLETE while it is still working.</w:t>
-      </w:r>
-    </w:p>
-    <w:p>
-      <w:r>
-        <w:t xml:space="preserve">- On an unexpected error the script marks whichever phase was actually in flight as PROBLEM and writes the error message into Notes.</w:t>
-      </w:r>
-    </w:p>
-    <w:p>
-      <w:pPr>
-        <w:pStyle w:val="Heading2"/>
-      </w:pPr>
-      <w:r>
-        <w:t xml:space="preserve">11. Troubleshooting Guide</w:t>
-      </w:r>
-    </w:p>
-    <w:p>
-      <w:r>
-        <w:t xml:space="preserve">- "Start Date and/or End Date are missing": the Budget week - Studio record is not linked to a Budget week.</w:t>
-      </w:r>
-    </w:p>
-    <w:p>
-      <w:r>
-        <w:t xml:space="preserve">- "Studio is empty on this Budget week - Studio record": link a Studio.</w:t>
-      </w:r>
-    </w:p>
-    <w:p>
-      <w:r>
-        <w:t xml:space="preserve">- "Studio X has no MTEK Location ID": fill MTEK Location ID on the Studios record.</w:t>
-      </w:r>
-    </w:p>
-    <w:p>
-      <w:r>
-        <w:t xml:space="preserve">- Far too many punches returned: check that the script is still using min_start_datetime / max_start_datetime. Reverting to min_date / max_date returns the entire history without erroring.</w:t>
-      </w:r>
-    </w:p>
-    <w:p>
-      <w:r>
-        <w:t xml:space="preserve">- Employee Status shows PROBLEM: the punch's Employee Name has no exact match in Employees (First Name + Last Name). Accents and trailing spaces matter less than expected because matching is trimmed and case-insensitive, but the two halves must still concatenate to the same string.</w:t>
-      </w:r>
-    </w:p>
-    <w:p>
-      <w:r>
-        <w:t xml:space="preserve">- Rate type Status shows PROBLEM: there is no Rates record named "&lt;Employee name&gt; &lt;Shift Type&gt;" for that combination. Note that a rate which exists but is set to $0.00 is NOT a PROBLEM; it matches fine and simply contributes nothing to Wages.</w:t>
-      </w:r>
-    </w:p>
-    <w:p>
-      <w:r>
-        <w:t xml:space="preserve">- Nothing happens when clicking Fetch time punches: confirm the Make scenario is active and its keychain key is still valid.</w:t>
-      </w:r>
-    </w:p>
-    <w:p>
-      <w:pPr>
-        <w:pStyle w:val="Heading2"/>
-      </w:pPr>
-      <w:r>
-        <w:t xml:space="preserve">12. Known Data Issues</w:t>
-      </w:r>
-    </w:p>
-    <w:p>
-      <w:r>
-        <w:t xml:space="preserve">- b.home and Vieux-port in the HR Studios table share MTEK Location ID 48719. A fetch for either returns the same punches, so creating a Budget week - Studio row for both in the same week double-counts those hours.</w:t>
-      </w:r>
-    </w:p>
-    <w:p>
-      <w:r>
-        <w:t xml:space="preserve">- Many EE rows in the Rates table have a Rate of $0.00. Those punches match correctly and show as COMPLETE, but contribute nothing to Wages, so they read as unpaid hours rather than as an error.</w:t>
-      </w:r>
-    </w:p>
-    <w:p>
-      <w:r>
-        <w:t xml:space="preserve">- The GITHUB BEARER keychain key is shared by several Make scenarios. Rotating that token breaks all of them, not just this one.</w:t>
-      </w:r>
-    </w:p>
-    <w:p>
-      <w:pPr>
-        <w:pStyle w:val="Heading2"/>
-      </w:pPr>
-      <w:r>
-        <w:t xml:space="preserve">13. Verification Record</w:t>
-      </w:r>
-    </w:p>
-    <w:p>
-      <w:r>
-        <w:t xml:space="preserve">Rockland, 2026-08-23 to 2026-08-29: 46 punches, 152.00 hours, $2,754.80, with 0 unmatched employees and 0 unmatched rates. Hours were cross-checked directly against MTEK shift durations and matched exactly. A second run over the same record created 0 punches and skipped 46, confirming dedupe.</w:t>
-      </w:r>
-    </w:p>
-    <w:p>
-      <w:r>
-        <w:t xml:space="preserve">A $3.25 difference against a manually maintained payroll sheet traced to a single rate (Kelly Morrice MC/SC at $19.82 in Airtable versus $18.82 on the sheet); every other employee and rate combination reconciled to the cent.</w:t>
-      </w:r>
-    </w:p>
-    <w:p>
-      <w:pPr>
-        <w:pStyle w:val="Heading2"/>
-      </w:pPr>
-      <w:r>
-        <w:t xml:space="preserve">14. Summary</w:t>
-      </w:r>
-    </w:p>
-    <w:p>
-      <w:r>
-        <w:t xml:space="preserve">An on-demand, idempotent staff payroll import: one click per studio per week pulls that week's time clock punches from Mariana Tek, links them to the right employee and pay rate, and reports hours, wages and any unmatched records back onto the triggering row.</w:t>
+        <w:t xml:space="preserve">- Overall Status: Started as the very first write, before the try block (same shape as the instructors script). COMPLETE only when nothing needs a human; PROBLEM for any unmatched employee or rate, any punch still without a clock-out, or any thrown error.</w:t>
+      </w:r>
+    </w:p>
+    <w:p>
+      <w:r>
+        <w:t xml:space="preserve">- Time punch Status and Time in/out Status: Started together at the top; set together once punches are in. Time in/out Status is PROBLEM while any punch on the row has no clock-out.</w:t>
+      </w:r>
+    </w:p>
+    <w:p>
+      <w:r>
+        <w:t xml:space="preserve">- Employee Status: Started once punches are in; COMPLETE, or PROBLEM if any employee is unmatched.</w:t>
+      </w:r>
+    </w:p>
+    <w:p>
+      <w:r>
+        <w:t xml:space="preserve">- Rate type Status: Started once employees are done; COMPLETE, or PROBLEM if any rate is unmatched.</w:t>
+      </w:r>
+    </w:p>
+    <w:p>
+      <w:r>
+        <w:t xml:space="preserve">- Employee and Rate type are cleared at the start so a re-run cannot show stale results. A crash marks whichever phase was in flight.</w:t>
+      </w:r>
+    </w:p>
+    <w:p>
+      <w:pPr>
+        <w:pStyle w:val="Heading2"/>
+      </w:pPr>
+      <w:r>
+        <w:t xml:space="preserve">11. Empty Fetches Fail</w:t>
+      </w:r>
+    </w:p>
+    <w:p>
+      <w:r>
+        <w:t xml:space="preserve">If MTEK returns no punches for the studio and week, the run throws with "No time punches found in MTEK for &lt;studio&gt; ... Check the studio and the week." and lands on PROBLEM. Everyone works every day, so an empty studio-week is always a mistake - most often a SPINCO studio, since this script only queries b.cycle's MTEK, where a SPINCO location returns 0.</w:t>
+      </w:r>
+    </w:p>
+    <w:p>
+      <w:pPr>
+        <w:pStyle w:val="Heading2"/>
+      </w:pPr>
+      <w:r>
+        <w:t xml:space="preserve">12. Notes Log Format</w:t>
+      </w:r>
+    </w:p>
+    <w:p>
+      <w:r>
+        <w:t xml:space="preserve">Notes is append-only. Each run prepends "[YYYY-MM-DD HH:MM EDT|EST] &lt;summary&gt;" followed by any "Differs from MTEK" and "No longer in MTEK" lines, and keeps earlier entries below. The zone abbreviation is real, not hardcoded. Entries are capped at 5,000 characters and the field at 100,000, oldest dropping off.</w:t>
+      </w:r>
+    </w:p>
+    <w:p>
+      <w:r>
+        <w:t xml:space="preserve">Summary fields: punches in MTEK, new punches, duplicates skipped, clock-outs filled, punches with no clock-out, differs from MTEK, no longer in MTEK, employees not found, rates not found, week total hours, week total wages. Totals cover every punch on the row.</w:t>
+      </w:r>
+    </w:p>
+    <w:p>
+      <w:pPr>
+        <w:pStyle w:val="Heading2"/>
+      </w:pPr>
+      <w:r>
+        <w:t xml:space="preserve">13. Employee Matching</w:t>
+      </w:r>
+    </w:p>
+    <w:p>
+      <w:r>
+        <w:t xml:space="preserve">Employees are matched from the "Active Employees - ALL" view (viws8tSbvXfujLnwG), not the whole table. The table holds several hundred rows including former staff, with dozens of duplicated names; first-match-wins against the whole table resolved a number of current staff to a stale Inactive or Offboarding record. A handful of names remain duplicated within the active view and are still resolved first-match-wins.</w:t>
+      </w:r>
+    </w:p>
+    <w:p>
+      <w:pPr>
+        <w:pStyle w:val="Heading2"/>
+      </w:pPr>
+      <w:r>
+        <w:t xml:space="preserve">14. Troubleshooting Guide</w:t>
+      </w:r>
+    </w:p>
+    <w:p>
+      <w:r>
+        <w:t xml:space="preserve">- "No time punches found in MTEK": wrong studio (SPINCO?) or wrong week.</w:t>
+      </w:r>
+    </w:p>
+    <w:p>
+      <w:r>
+        <w:t xml:space="preserve">- "Start Date and/or End Date are missing": the row is not linked to a Budget week.</w:t>
+      </w:r>
+    </w:p>
+    <w:p>
+      <w:r>
+        <w:t xml:space="preserve">- "Studio is empty" / "has no MTEK Location ID": fix the row or the Studios record.</w:t>
+      </w:r>
+    </w:p>
+    <w:p>
+      <w:r>
+        <w:t xml:space="preserve">- Time in/out Status PROBLEM: a punch has no clock-out. Re-fetch once it is closed in MTEK; the clock-out fills in automatically.</w:t>
+      </w:r>
+    </w:p>
+    <w:p>
+      <w:r>
+        <w:t xml:space="preserve">- Employee Status PROBLEM: no exact match in the Active Employees - ALL view (check the view and spelling).</w:t>
+      </w:r>
+    </w:p>
+    <w:p>
+      <w:r>
+        <w:t xml:space="preserve">- Rate type Status PROBLEM: no Rates record named "&lt;Employee name&gt; &lt;Shift Type&gt;". A rate that exists at $0.00 is not a PROBLEM.</w:t>
+      </w:r>
+    </w:p>
+    <w:p>
+      <w:r>
+        <w:t xml:space="preserve">- Far too many punches: confirm the script still uses min/max_start_datetime.</w:t>
+      </w:r>
+    </w:p>
+    <w:p>
+      <w:r>
+        <w:t xml:space="preserve">- Clicking the button does nothing: confirm the Make scenario is active and its keychain key is valid.</w:t>
+      </w:r>
+    </w:p>
+    <w:p>
+      <w:pPr>
+        <w:pStyle w:val="Heading2"/>
+      </w:pPr>
+      <w:r>
+        <w:t xml:space="preserve">15. Completeness Assurance</w:t>
+      </w:r>
+    </w:p>
+    <w:p>
+      <w:r>
+        <w:t xml:space="preserve">Verified not a risk, from a full-month pull of every punch across all locations:</w:t>
+      </w:r>
+    </w:p>
+    <w:p>
+      <w:r>
+        <w:t xml:space="preserve">- Pagination is complete: every reported punch received across all pages, no duplicates.</w:t>
+      </w:r>
+    </w:p>
+    <w:p>
+      <w:r>
+        <w:t xml:space="preserve">- No status/approval filtering exists on punches.</w:t>
+      </w:r>
+    </w:p>
+    <w:p>
+      <w:r>
+        <w:t xml:space="preserve">- Every punch belonged to one of the four mapped b.cycle studios; none without a location.</w:t>
+      </w:r>
+    </w:p>
+    <w:p>
+      <w:r>
+        <w:t xml:space="preserve">- Date edges are padded and MTEK over-returns at the boundary, the safe direction.</w:t>
+      </w:r>
+    </w:p>
+    <w:p>
+      <w:r>
+        <w:t xml:space="preserve">- Failures are loud: MTEK errors stop the run before anything is written.</w:t>
+      </w:r>
+    </w:p>
+    <w:p>
+      <w:r>
+        <w:t xml:space="preserve">Residual, by design:</w:t>
+      </w:r>
+    </w:p>
+    <w:p>
+      <w:r>
+        <w:t xml:space="preserve">- Budget week - Studio rows are created manually. A studio with no row for a week is not fetched. This was a deliberate choice not to automate.</w:t>
+      </w:r>
+    </w:p>
+    <w:p>
+      <w:r>
+        <w:t xml:space="preserve">- MTEK edits to already-imported punches are reported, not applied.</w:t>
+      </w:r>
+    </w:p>
+    <w:p>
+      <w:r>
+        <w:t xml:space="preserve">- b.home and Vieux-port share MTEK Location ID 48719; rows for both in one week double-count.</w:t>
+      </w:r>
+    </w:p>
+    <w:p>
+      <w:r>
+        <w:t xml:space="preserve">- A shift crossing 2am on a DST-change night is off by an hour (studios are closed then). A punch with no start time is skipped (none observed).</w:t>
+      </w:r>
+    </w:p>
+    <w:p>
+      <w:pPr>
+        <w:pStyle w:val="Heading2"/>
+      </w:pPr>
+      <w:r>
+        <w:t xml:space="preserve">16. Verification Record</w:t>
+      </w:r>
+    </w:p>
+    <w:p>
+      <w:r>
+        <w:t xml:space="preserve">Rockland, 2026-08-23 to 2026-08-29: 46 punches, 0 unmatched employees, 0 unmatched rates. Hours cross-checked directly against MTEK shift durations and matched exactly. Wages reconciled against a manually maintained payroll sheet down to a single rate, traced to a Rates record changed after the sheet was built.</w:t>
+      </w:r>
+    </w:p>
+    <w:p>
+      <w:r>
+        <w:t xml:space="preserve">2026-09-10 reconciliation tests on throwaway rows: a SPINCO studio failed loudly with "No time punches found"; a blanked clock-out was filled back from MTEK; an edited Time In was reported and left unchanged; a punch whose MTEK ID no longer existed was reported and held Time in/out and Overall Status at PROBLEM, and the real shift behind it was re-imported. Week totals reconciled by hand.</w:t>
+      </w:r>
+    </w:p>
+    <w:p>
+      <w:pPr>
+        <w:pStyle w:val="Heading2"/>
+      </w:pPr>
+      <w:r>
+        <w:t xml:space="preserve">17. Summary</w:t>
+      </w:r>
+    </w:p>
+    <w:p>
+      <w:r>
+        <w:t xml:space="preserve">An on-demand, idempotent staff payroll import that reconciles rather than blindly appends: one click per studio per week pulls that week's punches, links them to the right employee and rate, fills in late clock-outs, flags anything that no longer agrees with MTEK, and refuses to report success on an empty result.</w:t>
       </w:r>
     </w:p>
     <w:sectPr>

</xml_diff>

<commit_message>
Document that the time punch fetch now enforces completeness
Records the new guarantee — every punch MTEK reports arrives, or the run fails
before writing anything — in the README and the workflow's documentation, along
with the tests behind it. Also records the known limitation that dedupe is
scoped to one Budget week - Studio row.

Co-Authored-By: Claude Opus 5 <noreply@anthropic.com>
</commit_message>
<xml_diff>
--- a/docs/HR_Payroll_Time_Punches_Documentation.docx
+++ b/docs/HR_Payroll_Time_Punches_Documentation.docx
@@ -66,6 +66,11 @@
     </w:p>
     <w:p>
       <w:r>
+        <w:t xml:space="preserve">- Refuses to continue unless it can prove every punch MTEK reports was received (section 15).</w:t>
+      </w:r>
+    </w:p>
+    <w:p>
+      <w:r>
         <w:t xml:space="preserve">- Reconciles against punches already on the row: creates new ones, fills clock-outs that were open last time, and reports anything that disagrees with MTEK without overwriting it (section 9).</w:t>
       </w:r>
     </w:p>
@@ -412,6 +417,16 @@
     </w:p>
     <w:p>
       <w:r>
+        <w:t xml:space="preserve">- "MTEK reported N time punches but M were received", "total changed during the fetch" or "came back without its data or paging info": MTEK returned an incomplete or shifting result. Nothing was imported - re-run the fetch.</w:t>
+      </w:r>
+    </w:p>
+    <w:p>
+      <w:r>
+        <w:t xml:space="preserve">- "has no readable start time": fix that punch in MTEK, then re-run.</w:t>
+      </w:r>
+    </w:p>
+    <w:p>
+      <w:r>
         <w:t xml:space="preserve">- "Start Date and/or End Date are missing": the row is not linked to a Budget week.</w:t>
       </w:r>
     </w:p>
@@ -455,12 +470,42 @@
     </w:p>
     <w:p>
       <w:r>
-        <w:t xml:space="preserve">Verified not a risk, from a full-month pull of every punch across all locations:</w:t>
-      </w:r>
-    </w:p>
-    <w:p>
-      <w:r>
-        <w:t xml:space="preserve">- Pagination is complete: every reported punch received across all pages, no duplicates.</w:t>
+        <w:t xml:space="preserve">Enforced on every run - the run fails before writing anything otherwise:</w:t>
+      </w:r>
+    </w:p>
+    <w:p>
+      <w:r>
+        <w:t xml:space="preserve">- Every MTEK page must carry its data and paging info; a malformed page stops the run instead of being taken as the last page.</w:t>
+      </w:r>
+    </w:p>
+    <w:p>
+      <w:r>
+        <w:t xml:space="preserve">- The total MTEK reports must be identical on every page; a change means records shifted between pages mid-fetch.</w:t>
+      </w:r>
+    </w:p>
+    <w:p>
+      <w:r>
+        <w:t xml:space="preserve">- The number of unique punches received must equal the total MTEK reports. Counting unique IDs also catches a skipped record hidden behind a duplicated one.</w:t>
+      </w:r>
+    </w:p>
+    <w:p>
+      <w:r>
+        <w:t xml:space="preserve">- A punch appearing on two pages is imported once.</w:t>
+      </w:r>
+    </w:p>
+    <w:p>
+      <w:r>
+        <w:t xml:space="preserve">- A punch whose start time cannot be read fails the run rather than being skipped.</w:t>
+      </w:r>
+    </w:p>
+    <w:p>
+      <w:r>
+        <w:t xml:space="preserve">- A studio-week with no punches at all fails the run (section 11).</w:t>
+      </w:r>
+    </w:p>
+    <w:p>
+      <w:r>
+        <w:t xml:space="preserve">Also verified not a risk, from a full-month pull of every punch across all locations:</w:t>
       </w:r>
     </w:p>
     <w:p>
@@ -527,6 +572,11 @@
       </w:r>
     </w:p>
     <w:p>
+      <w:r>
+        <w:t xml:space="preserve">2026-09-10 completeness tests: the fetch function was fed nine synthetic page sequences and accepted the three complete ones while throwing on all six faulty ones (page missing paging info, error body returned with a 200, empty body, total changing mid-fetch, fewer received than reported, and a skipped record masked by a duplicate). Against real MTEK it passed a multi-page month for one studio (208 punches) and for all four studios (725 punches) with no false alarm.</w:t>
+      </w:r>
+    </w:p>
+    <w:p>
       <w:pPr>
         <w:pStyle w:val="Heading2"/>
       </w:pPr>
@@ -536,7 +586,7 @@
     </w:p>
     <w:p>
       <w:r>
-        <w:t xml:space="preserve">An on-demand, idempotent staff payroll import that reconciles rather than blindly appends: one click per studio per week pulls that week's punches, links them to the right employee and rate, fills in late clock-outs, flags anything that no longer agrees with MTEK, and refuses to report success on an empty result.</w:t>
+        <w:t xml:space="preserve">An on-demand, idempotent staff payroll import that reconciles rather than blindly appends: one click per studio per week pulls that week's punches, proves every punch MTEK reports arrived, links them to the right employee and rate, fills in late clock-outs, flags anything that no longer agrees with MTEK, and refuses to report success on an empty result.</w:t>
       </w:r>
     </w:p>
     <w:sectPr>

</xml_diff>

<commit_message>
HR Payroll Time Punches: log counts only
GitHub Actions logs are public on this repo. The success log printed the
full Notes entry, including the week's wage total and employee names in the
Differs from MTEK / No longer in MTEK lists. It now prints counts only,
matching the Barter script; the full note still goes to Airtable Notes.

Documented in the README and the Time Punches doc.

Co-Authored-By: Claude Opus 5 <noreply@anthropic.com>
</commit_message>
<xml_diff>
--- a/docs/HR_Payroll_Time_Punches_Documentation.docx
+++ b/docs/HR_Payroll_Time_Punches_Documentation.docx
@@ -402,6 +402,11 @@
     <w:p>
       <w:r>
         <w:t xml:space="preserve">Summary fields: punches in MTEK, new punches, duplicates skipped, clock-outs filled, punches with no clock-out, differs from MTEK, no longer in MTEK, employees not found, rates not found, week total hours, week total wages. Totals cover every punch on the row.</w:t>
+      </w:r>
+    </w:p>
+    <w:p>
+      <w:r>
+        <w:t xml:space="preserve">The GitHub Actions log is public, because the repository is public, so the script prints counts only there: punches in MTEK, new, duplicates skipped, clock-outs filled, punches with no clock-out, differs from MTEK, no longer in MTEK, employees not found, rates not found. Employee names, week total hours and week total wages go to Notes in Airtable and nowhere else. Keep it that way when editing the script.</w:t>
       </w:r>
     </w:p>
     <w:p>

</xml_diff>